<commit_message>
docs(fleet): 94dce86 deployed and Agent-1 upgraded (5a6a3def, verified); installer reader fault and fix recorded; checklist and briefing current
Co-Authored-By: Claude Opus 5.5 <noreply@anthropic.com>
Claude-Session: https://claude.ai/code/session_01PKLvKpkcUa61F7SZmYPyoz
</commit_message>
<xml_diff>
--- a/docs/briefing/Agent-Fleet-Engineering-Briefing.docx
+++ b/docs/briefing/Agent-Fleet-Engineering-Briefing.docx
@@ -54,30 +54,10 @@
           <w:sz w:val="18"/>
           <w:szCs w:val="18"/>
         </w:rPr>
-        <w:t xml:space="preserve">1743b33</w:t>
-      </w:r>
-      <w:r>
-        <w:t xml:space="preserve">, database schema v93, Fleet HQ UI 0.26.0. </w:t>
-      </w:r>
-      <w:r>
-        <w:rPr>
-          <w:b/>
-        </w:rPr>
-        <w:t xml:space="preserve">Prepared, not installed:</w:t>
-      </w:r>
-      <w:r>
-        <w:t xml:space="preserve"> release </w:t>
-      </w:r>
-      <w:r>
-        <w:rPr>
-          <w:rFonts w:ascii="Consolas" w:hAnsi="Consolas" w:cs="Consolas"/>
-          <w:sz w:val="18"/>
-          <w:szCs w:val="18"/>
-        </w:rPr>
-        <w:t xml:space="preserve">f72a479</w:t>
-      </w:r>
-      <w:r>
-        <w:t xml:space="preserve">, schema v94, UI 0.26.2.</w:t>
+        <w:t xml:space="preserve">94dce86</w:t>
+      </w:r>
+      <w:r>
+        <w:t xml:space="preserve">, database schema v94, Fleet HQ UI 0.26.2 (deployed 2026-10-18 17:21Z). Agent-1 runs 94dce86 (upgraded 17:39Z).</w:t>
       </w:r>
     </w:p>
     <w:p>
@@ -11073,10 +11053,10 @@
           <w:sz w:val="18"/>
           <w:szCs w:val="18"/>
         </w:rPr>
-        <w:t xml:space="preserve">1743b33</w:t>
-      </w:r>
-      <w:r>
-        <w:t xml:space="preserve">, schema 93, UI 0.26.0, deployed 2026-10-17 19:36Z. Approved = pinned = Operator API.</w:t>
+        <w:t xml:space="preserve">94dce86</w:t>
+      </w:r>
+      <w:r>
+        <w:t xml:space="preserve">, schema 94, UI 0.26.2, deployed 2026-10-18 17:21Z (85486f5 at 15:57Z before it). Approved = pinned.</w:t>
       </w:r>
     </w:p>
     <w:p>
@@ -11129,10 +11109,10 @@
           <w:sz w:val="18"/>
           <w:szCs w:val="18"/>
         </w:rPr>
-        <w:t xml:space="preserve">f2a1784</w:t>
-      </w:r>
-      <w:r>
-        <w:t xml:space="preserve">, PAUSED (since 13:11:15Z).</w:t>
+        <w:t xml:space="preserve">94dce86</w:t>
+      </w:r>
+      <w:r>
+        <w:t xml:space="preserve"> (upgrade 5a6a3def…, verified), PAUSED.</w:t>
       </w:r>
     </w:p>
     <w:p>
@@ -11208,10 +11188,10 @@
         <w:rPr>
           <w:b/>
         </w:rPr>
-        <w:t xml:space="preserve">Permissions still open from the 2026-10-18 proof</w:t>
-      </w:r>
-      <w:r>
-        <w:t xml:space="preserve"> (until the owner runs </w:t>
+        <w:t xml:space="preserve">Permissions:</w:t>
+      </w:r>
+      <w:r>
+        <w:t xml:space="preserve"> the 2026-10-18 proof's permissions were closed by the owner (</w:t>
       </w:r>
       <w:r>
         <w:rPr>
@@ -11222,43 +11202,7 @@
         <w:t xml:space="preserve">proof.sh stop</w:t>
       </w:r>
       <w:r>
-        <w:t xml:space="preserve">; the auto-stop timer fires 2026-10-21 12:26Z):</w:t>
-      </w:r>
-    </w:p>
-    <w:p>
-      <w:pPr>
-        <w:numPr>
-          <w:ilvl w:val="1"/>
-          <w:numId w:val="1"/>
-        </w:numPr>
-        <w:spacing w:after="40" w:line="240" w:lineRule="auto"/>
-      </w:pPr>
-      <w:r>
-        <w:t xml:space="preserve">custody activation (pilot, £5 per instruction, £5 a day);</w:t>
-      </w:r>
-    </w:p>
-    <w:p>
-      <w:pPr>
-        <w:numPr>
-          <w:ilvl w:val="1"/>
-          <w:numId w:val="1"/>
-        </w:numPr>
-        <w:spacing w:after="40" w:line="240" w:lineRule="auto"/>
-      </w:pPr>
-      <w:r>
-        <w:t xml:space="preserve">card authority (card 1, £5 per charge, £5 a day);</w:t>
-      </w:r>
-    </w:p>
-    <w:p>
-      <w:pPr>
-        <w:numPr>
-          <w:ilvl w:val="1"/>
-          <w:numId w:val="1"/>
-        </w:numPr>
-        <w:spacing w:after="40" w:line="240" w:lineRule="auto"/>
-      </w:pPr>
-      <w:r>
-        <w:t xml:space="preserve">mail release to the owner's address.</w:t>
+        <w:t xml:space="preserve">): no outward release, card authority off, custody off, no timer, no open run budget.</w:t>
       </w:r>
     </w:p>
     <w:p>
@@ -11936,18 +11880,29 @@
         <w:keepNext/>
       </w:pPr>
       <w:r>
-        <w:t xml:space="preserve">11.5 The prepared repair: release </w:t>
-      </w:r>
-      <w:r>
-        <w:rPr>
-          <w:rFonts w:ascii="Consolas" w:hAnsi="Consolas" w:cs="Consolas"/>
-          <w:sz w:val="18"/>
-          <w:szCs w:val="18"/>
-        </w:rPr>
-        <w:t xml:space="preserve">f72a479</w:t>
-      </w:r>
-      <w:r>
-        <w:t xml:space="preserve"> (v94, UI 0.26.2), not installed</w:t>
+        <w:t xml:space="preserve">11.5 The repair: releases </w:t>
+      </w:r>
+      <w:r>
+        <w:rPr>
+          <w:rFonts w:ascii="Consolas" w:hAnsi="Consolas" w:cs="Consolas"/>
+          <w:sz w:val="18"/>
+          <w:szCs w:val="18"/>
+        </w:rPr>
+        <w:t xml:space="preserve">85486f5</w:t>
+      </w:r>
+      <w:r>
+        <w:t xml:space="preserve"> + </w:t>
+      </w:r>
+      <w:r>
+        <w:rPr>
+          <w:rFonts w:ascii="Consolas" w:hAnsi="Consolas" w:cs="Consolas"/>
+          <w:sz w:val="18"/>
+          <w:szCs w:val="18"/>
+        </w:rPr>
+        <w:t xml:space="preserve">94dce86</w:t>
+      </w:r>
+      <w:r>
+        <w:t xml:space="preserve"> (v94, UI 0.26.2), INSTALLED 2026-10-18</w:t>
       </w:r>
     </w:p>
     <w:p>

</xml_diff>